<commit_message>
docs: refine submission cover and ER diagram
</commit_message>
<xml_diff>
--- a/deliverables/Agnos_Backend_Assignment_Documentation.docx
+++ b/deliverables/Agnos_Backend_Assignment_Documentation.docx
@@ -28,8 +28,6 @@
       </w:pPr>
       <w:r>
         <w:t>Go • Gin • PostgreSQL • Docker Compose • Nginx</w:t>
-        <w:br/>
-        <w:t>Version 1.0 • September 2026</w:t>
       </w:r>
     </w:p>
     <w:p/>
@@ -2392,7 +2390,7 @@
       <w:r>
         <w:drawing>
           <wp:inline xmlns:a="http://schemas.openxmlformats.org/drawingml/2006/main" xmlns:pic="http://schemas.openxmlformats.org/drawingml/2006/picture">
-            <wp:extent cx="6400800" cy="3698240"/>
+            <wp:extent cx="6400800" cy="4267200"/>
             <wp:docPr id="1" name="Picture 1"/>
             <wp:cNvGraphicFramePr>
               <a:graphicFrameLocks noChangeAspect="1"/>
@@ -2413,7 +2411,7 @@
                   <pic:spPr>
                     <a:xfrm>
                       <a:off x="0" y="0"/>
-                      <a:ext cx="6400800" cy="3698240"/>
+                      <a:ext cx="6400800" cy="4267200"/>
                     </a:xfrm>
                     <a:prstGeom prst="rect"/>
                   </pic:spPr>

</xml_diff>